<commit_message>
Removed a couple erronous lines caught by the CSS Validation Site
</commit_message>
<xml_diff>
--- a/Project Journal.docx
+++ b/Project Journal.docx
@@ -70,7 +70,25 @@
             <w:sz w:val="24"/>
             <w:szCs w:val="24"/>
           </w:rPr>
-          <w:t>Link to Git Repo</w:t>
+          <w:t xml:space="preserve">Link to </w:t>
+        </w:r>
+        <w:proofErr w:type="spellStart"/>
+        <w:r>
+          <w:rPr>
+            <w:rStyle w:val="Hyperlink"/>
+            <w:sz w:val="24"/>
+            <w:szCs w:val="24"/>
+          </w:rPr>
+          <w:t>Git</w:t>
+        </w:r>
+        <w:proofErr w:type="spellEnd"/>
+        <w:r>
+          <w:rPr>
+            <w:rStyle w:val="Hyperlink"/>
+            <w:sz w:val="24"/>
+            <w:szCs w:val="24"/>
+          </w:rPr>
+          <w:t xml:space="preserve"> Repo</w:t>
         </w:r>
       </w:hyperlink>
     </w:p>
@@ -618,8 +636,17 @@
           <w:sz w:val="24"/>
           <w:szCs w:val="24"/>
         </w:rPr>
-        <w:t>Trying to center the navbar instead of having it on the right like it was in the homeworks</w:t>
-      </w:r>
+        <w:t xml:space="preserve">Trying to center the navbar instead of having it on the right like it was in the </w:t>
+      </w:r>
+      <w:proofErr w:type="spellStart"/>
+      <w:r>
+        <w:rPr>
+          <w:sz w:val="24"/>
+          <w:szCs w:val="24"/>
+        </w:rPr>
+        <w:t>homeworks</w:t>
+      </w:r>
+      <w:proofErr w:type="spellEnd"/>
     </w:p>
     <w:p>
       <w:pPr>
@@ -968,7 +995,23 @@
           <w:sz w:val="24"/>
           <w:szCs w:val="24"/>
         </w:rPr>
-        <w:t>Added the Projects section with working link to git repo of timer program</w:t>
+        <w:t xml:space="preserve">Added the Projects section with working link to </w:t>
+      </w:r>
+      <w:proofErr w:type="spellStart"/>
+      <w:r>
+        <w:rPr>
+          <w:sz w:val="24"/>
+          <w:szCs w:val="24"/>
+        </w:rPr>
+        <w:t>git</w:t>
+      </w:r>
+      <w:proofErr w:type="spellEnd"/>
+      <w:r>
+        <w:rPr>
+          <w:sz w:val="24"/>
+          <w:szCs w:val="24"/>
+        </w:rPr>
+        <w:t xml:space="preserve"> repo of timer program</w:t>
       </w:r>
     </w:p>
     <w:p>
@@ -1036,7 +1079,23 @@
           <w:sz w:val="24"/>
           <w:szCs w:val="24"/>
         </w:rPr>
-        <w:t>The resume pdf wasn’t very readable when I initially used &lt;embed&gt; to get it into the popup, the zoom was initially set to 34% for some reason whenever I clicked on it.</w:t>
+        <w:t xml:space="preserve">The resume pdf </w:t>
+      </w:r>
+      <w:proofErr w:type="gramStart"/>
+      <w:r>
+        <w:rPr>
+          <w:sz w:val="24"/>
+          <w:szCs w:val="24"/>
+        </w:rPr>
+        <w:t>wasn’t</w:t>
+      </w:r>
+      <w:proofErr w:type="gramEnd"/>
+      <w:r>
+        <w:rPr>
+          <w:sz w:val="24"/>
+          <w:szCs w:val="24"/>
+        </w:rPr>
+        <w:t xml:space="preserve"> very readable when I initially used &lt;embed&gt; to get it into the popup, the zoom was initially set to 34% for some reason whenever I clicked on it.</w:t>
       </w:r>
     </w:p>
     <w:p>
@@ -1065,7 +1124,23 @@
           <w:sz w:val="24"/>
           <w:szCs w:val="24"/>
         </w:rPr>
-        <w:t xml:space="preserve"> I switched to &lt;iframe&gt; which made the popup come up at 100% instead.</w:t>
+        <w:t xml:space="preserve"> I switched to &lt;</w:t>
+      </w:r>
+      <w:proofErr w:type="spellStart"/>
+      <w:r>
+        <w:rPr>
+          <w:sz w:val="24"/>
+          <w:szCs w:val="24"/>
+        </w:rPr>
+        <w:t>iframe</w:t>
+      </w:r>
+      <w:proofErr w:type="spellEnd"/>
+      <w:r>
+        <w:rPr>
+          <w:sz w:val="24"/>
+          <w:szCs w:val="24"/>
+        </w:rPr>
+        <w:t>&gt; which made the popup come up at 100% instead.</w:t>
       </w:r>
     </w:p>
     <w:p>
@@ -1094,7 +1169,23 @@
           <w:sz w:val="24"/>
           <w:szCs w:val="24"/>
         </w:rPr>
-        <w:t>The close ‘x’ button was in a bad place, it was right on top on the three vertical dots in the top right corner of the popup</w:t>
+        <w:t xml:space="preserve">The close ‘x’ button was in a bad </w:t>
+      </w:r>
+      <w:proofErr w:type="gramStart"/>
+      <w:r>
+        <w:rPr>
+          <w:sz w:val="24"/>
+          <w:szCs w:val="24"/>
+        </w:rPr>
+        <w:t>place,</w:t>
+      </w:r>
+      <w:proofErr w:type="gramEnd"/>
+      <w:r>
+        <w:rPr>
+          <w:sz w:val="24"/>
+          <w:szCs w:val="24"/>
+        </w:rPr>
+        <w:t xml:space="preserve"> it was right on top on the three vertical dots in the top right corner of the popup</w:t>
       </w:r>
     </w:p>
     <w:p>
@@ -1123,7 +1214,31 @@
           <w:sz w:val="24"/>
           <w:szCs w:val="24"/>
         </w:rPr>
-        <w:t xml:space="preserve"> I created a header section for the popup window and just put the close button in there so it wouldn’t overlap with any other buttons inherit to the &lt;ifram</w:t>
+        <w:t xml:space="preserve"> I created a header section for the popup window and just put the close button in there so it </w:t>
+      </w:r>
+      <w:proofErr w:type="gramStart"/>
+      <w:r>
+        <w:rPr>
+          <w:sz w:val="24"/>
+          <w:szCs w:val="24"/>
+        </w:rPr>
+        <w:t>wouldn’t</w:t>
+      </w:r>
+      <w:proofErr w:type="gramEnd"/>
+      <w:r>
+        <w:rPr>
+          <w:sz w:val="24"/>
+          <w:szCs w:val="24"/>
+        </w:rPr>
+        <w:t xml:space="preserve"> overlap with any other buttons inherit to the &lt;</w:t>
+      </w:r>
+      <w:proofErr w:type="spellStart"/>
+      <w:r>
+        <w:rPr>
+          <w:sz w:val="24"/>
+          <w:szCs w:val="24"/>
+        </w:rPr>
+        <w:t>ifram</w:t>
       </w:r>
       <w:r>
         <w:rPr>
@@ -1132,6 +1247,7 @@
         </w:rPr>
         <w:t>e</w:t>
       </w:r>
+      <w:proofErr w:type="spellEnd"/>
       <w:r>
         <w:rPr>
           <w:sz w:val="24"/>
@@ -1490,7 +1606,23 @@
           <w:sz w:val="24"/>
           <w:szCs w:val="24"/>
         </w:rPr>
-        <w:t xml:space="preserve"> Finally found and deleted a rogue form section in the css file that was dictating the max-width</w:t>
+        <w:t xml:space="preserve"> Finally found and deleted a rogue form section in the </w:t>
+      </w:r>
+      <w:proofErr w:type="spellStart"/>
+      <w:r>
+        <w:rPr>
+          <w:sz w:val="24"/>
+          <w:szCs w:val="24"/>
+        </w:rPr>
+        <w:t>css</w:t>
+      </w:r>
+      <w:proofErr w:type="spellEnd"/>
+      <w:r>
+        <w:rPr>
+          <w:sz w:val="24"/>
+          <w:szCs w:val="24"/>
+        </w:rPr>
+        <w:t xml:space="preserve"> file that was dictating the max-width</w:t>
       </w:r>
     </w:p>
     <w:p>
@@ -1760,7 +1892,23 @@
           <w:sz w:val="24"/>
           <w:szCs w:val="24"/>
         </w:rPr>
-        <w:t>Webpage wasn’t working</w:t>
+        <w:t xml:space="preserve">Webpage </w:t>
+      </w:r>
+      <w:proofErr w:type="gramStart"/>
+      <w:r>
+        <w:rPr>
+          <w:sz w:val="24"/>
+          <w:szCs w:val="24"/>
+        </w:rPr>
+        <w:t>wasn’t</w:t>
+      </w:r>
+      <w:proofErr w:type="gramEnd"/>
+      <w:r>
+        <w:rPr>
+          <w:sz w:val="24"/>
+          <w:szCs w:val="24"/>
+        </w:rPr>
+        <w:t xml:space="preserve"> working</w:t>
       </w:r>
     </w:p>
     <w:p>
@@ -2021,7 +2169,39 @@
           <w:sz w:val="24"/>
           <w:szCs w:val="24"/>
         </w:rPr>
-        <w:t>The webpage url didn’t look right, my username had to be spelled out twice</w:t>
+        <w:t xml:space="preserve">The webpage </w:t>
+      </w:r>
+      <w:proofErr w:type="spellStart"/>
+      <w:r>
+        <w:rPr>
+          <w:sz w:val="24"/>
+          <w:szCs w:val="24"/>
+        </w:rPr>
+        <w:t>url</w:t>
+      </w:r>
+      <w:proofErr w:type="spellEnd"/>
+      <w:r>
+        <w:rPr>
+          <w:sz w:val="24"/>
+          <w:szCs w:val="24"/>
+        </w:rPr>
+        <w:t xml:space="preserve"> </w:t>
+      </w:r>
+      <w:proofErr w:type="gramStart"/>
+      <w:r>
+        <w:rPr>
+          <w:sz w:val="24"/>
+          <w:szCs w:val="24"/>
+        </w:rPr>
+        <w:t>didn’t</w:t>
+      </w:r>
+      <w:proofErr w:type="gramEnd"/>
+      <w:r>
+        <w:rPr>
+          <w:sz w:val="24"/>
+          <w:szCs w:val="24"/>
+        </w:rPr>
+        <w:t xml:space="preserve"> look right, my username had to be spelled out twice</w:t>
       </w:r>
     </w:p>
     <w:p>
@@ -2052,7 +2232,39 @@
           <w:sz w:val="24"/>
           <w:szCs w:val="24"/>
         </w:rPr>
-        <w:t>I hadn’t named the repo exactly as my username on git so once I made that change the url worked as expected</w:t>
+        <w:t xml:space="preserve">I </w:t>
+      </w:r>
+      <w:proofErr w:type="gramStart"/>
+      <w:r>
+        <w:rPr>
+          <w:sz w:val="24"/>
+          <w:szCs w:val="24"/>
+        </w:rPr>
+        <w:t>hadn’t</w:t>
+      </w:r>
+      <w:proofErr w:type="gramEnd"/>
+      <w:r>
+        <w:rPr>
+          <w:sz w:val="24"/>
+          <w:szCs w:val="24"/>
+        </w:rPr>
+        <w:t xml:space="preserve"> named the repo exactly as my username on git so once I made that change the </w:t>
+      </w:r>
+      <w:proofErr w:type="spellStart"/>
+      <w:r>
+        <w:rPr>
+          <w:sz w:val="24"/>
+          <w:szCs w:val="24"/>
+        </w:rPr>
+        <w:t>url</w:t>
+      </w:r>
+      <w:proofErr w:type="spellEnd"/>
+      <w:r>
+        <w:rPr>
+          <w:sz w:val="24"/>
+          <w:szCs w:val="24"/>
+        </w:rPr>
+        <w:t xml:space="preserve"> worked as expected</w:t>
       </w:r>
     </w:p>
     <w:p>
@@ -2505,7 +2717,7 @@
           <w:sz w:val="24"/>
           <w:szCs w:val="24"/>
         </w:rPr>
-        <w:t>#</w:t>
+        <w:t>7</w:t>
       </w:r>
       <w:r>
         <w:rPr>
@@ -2562,6 +2774,290 @@
           <w:szCs w:val="24"/>
         </w:rPr>
         <w:t>/2024</w:t>
+      </w:r>
+    </w:p>
+    <w:p>
+      <w:pPr>
+        <w:rPr>
+          <w:b/>
+          <w:bCs/>
+          <w:sz w:val="24"/>
+          <w:szCs w:val="24"/>
+        </w:rPr>
+      </w:pPr>
+      <w:r>
+        <w:rPr>
+          <w:b/>
+          <w:bCs/>
+          <w:sz w:val="24"/>
+          <w:szCs w:val="24"/>
+        </w:rPr>
+        <w:t>What I Did</w:t>
+      </w:r>
+    </w:p>
+    <w:p>
+      <w:pPr>
+        <w:pStyle w:val="ListParagraph"/>
+        <w:numPr>
+          <w:ilvl w:val="0"/>
+          <w:numId w:val="17"/>
+        </w:numPr>
+        <w:rPr>
+          <w:b/>
+          <w:bCs/>
+          <w:sz w:val="24"/>
+          <w:szCs w:val="24"/>
+        </w:rPr>
+      </w:pPr>
+      <w:r>
+        <w:rPr>
+          <w:sz w:val="24"/>
+          <w:szCs w:val="24"/>
+        </w:rPr>
+        <w:t>Updated the README.md file with required information</w:t>
+      </w:r>
+    </w:p>
+    <w:p>
+      <w:pPr>
+        <w:rPr>
+          <w:b/>
+          <w:bCs/>
+          <w:sz w:val="24"/>
+          <w:szCs w:val="24"/>
+        </w:rPr>
+      </w:pPr>
+      <w:r>
+        <w:rPr>
+          <w:b/>
+          <w:bCs/>
+          <w:sz w:val="24"/>
+          <w:szCs w:val="24"/>
+        </w:rPr>
+        <w:t>Issues &amp; Solutions:</w:t>
+      </w:r>
+    </w:p>
+    <w:p>
+      <w:pPr>
+        <w:pStyle w:val="ListParagraph"/>
+        <w:numPr>
+          <w:ilvl w:val="0"/>
+          <w:numId w:val="17"/>
+        </w:numPr>
+        <w:rPr>
+          <w:b/>
+          <w:bCs/>
+          <w:sz w:val="24"/>
+          <w:szCs w:val="24"/>
+        </w:rPr>
+      </w:pPr>
+      <w:r>
+        <w:rPr>
+          <w:b/>
+          <w:bCs/>
+          <w:sz w:val="24"/>
+          <w:szCs w:val="24"/>
+        </w:rPr>
+        <w:t xml:space="preserve">Problem: </w:t>
+      </w:r>
+      <w:proofErr w:type="gramStart"/>
+      <w:r>
+        <w:rPr>
+          <w:sz w:val="24"/>
+          <w:szCs w:val="24"/>
+        </w:rPr>
+        <w:t>Couldn’t</w:t>
+      </w:r>
+      <w:proofErr w:type="gramEnd"/>
+      <w:r>
+        <w:rPr>
+          <w:sz w:val="24"/>
+          <w:szCs w:val="24"/>
+        </w:rPr>
+        <w:t xml:space="preserve"> figure out how to do second-tier bullet points correctly. I thought the correct “code” was to do “- - </w:t>
+      </w:r>
+      <w:proofErr w:type="gramStart"/>
+      <w:r>
+        <w:rPr>
+          <w:sz w:val="24"/>
+          <w:szCs w:val="24"/>
+        </w:rPr>
+        <w:t>“ but</w:t>
+      </w:r>
+      <w:proofErr w:type="gramEnd"/>
+      <w:r>
+        <w:rPr>
+          <w:sz w:val="24"/>
+          <w:szCs w:val="24"/>
+        </w:rPr>
+        <w:t xml:space="preserve"> that made it look like it was a bullet point featuring a bullet point.</w:t>
+      </w:r>
+    </w:p>
+    <w:p>
+      <w:pPr>
+        <w:pStyle w:val="ListParagraph"/>
+        <w:numPr>
+          <w:ilvl w:val="0"/>
+          <w:numId w:val="17"/>
+        </w:numPr>
+        <w:rPr>
+          <w:b/>
+          <w:bCs/>
+          <w:sz w:val="24"/>
+          <w:szCs w:val="24"/>
+        </w:rPr>
+      </w:pPr>
+      <w:r>
+        <w:rPr>
+          <w:b/>
+          <w:bCs/>
+          <w:sz w:val="24"/>
+          <w:szCs w:val="24"/>
+        </w:rPr>
+        <w:t>Solution:</w:t>
+      </w:r>
+      <w:r>
+        <w:rPr>
+          <w:sz w:val="24"/>
+          <w:szCs w:val="24"/>
+        </w:rPr>
+        <w:t xml:space="preserve"> After experimenting I found that the correct “code” is this: </w:t>
+      </w:r>
+      <w:proofErr w:type="gramStart"/>
+      <w:r>
+        <w:rPr>
+          <w:sz w:val="24"/>
+          <w:szCs w:val="24"/>
+        </w:rPr>
+        <w:t>“  -</w:t>
+      </w:r>
+      <w:proofErr w:type="gramEnd"/>
+      <w:r>
+        <w:rPr>
+          <w:sz w:val="24"/>
+          <w:szCs w:val="24"/>
+        </w:rPr>
+        <w:t>“. That is, two spaces and then a hyphen, instead of space, hyphen, space, and then hyphen.</w:t>
+      </w:r>
+    </w:p>
+    <w:p>
+      <w:pPr>
+        <w:rPr>
+          <w:b/>
+          <w:bCs/>
+          <w:sz w:val="24"/>
+          <w:szCs w:val="24"/>
+        </w:rPr>
+      </w:pPr>
+      <w:r>
+        <w:rPr>
+          <w:b/>
+          <w:bCs/>
+          <w:sz w:val="24"/>
+          <w:szCs w:val="24"/>
+        </w:rPr>
+        <w:t>Sources Used</w:t>
+      </w:r>
+      <w:r>
+        <w:rPr>
+          <w:b/>
+          <w:bCs/>
+          <w:sz w:val="24"/>
+          <w:szCs w:val="24"/>
+        </w:rPr>
+        <w:t>:</w:t>
+      </w:r>
+    </w:p>
+    <w:p>
+      <w:pPr>
+        <w:pStyle w:val="ListParagraph"/>
+        <w:numPr>
+          <w:ilvl w:val="0"/>
+          <w:numId w:val="18"/>
+        </w:numPr>
+        <w:rPr>
+          <w:sz w:val="24"/>
+          <w:szCs w:val="24"/>
+        </w:rPr>
+      </w:pPr>
+      <w:r>
+        <w:rPr>
+          <w:sz w:val="24"/>
+          <w:szCs w:val="24"/>
+        </w:rPr>
+        <w:t>https://www.markdownguide.org/basic-syntax/</w:t>
+      </w:r>
+    </w:p>
+    <w:p>
+      <w:pPr>
+        <w:rPr>
+          <w:sz w:val="24"/>
+          <w:szCs w:val="24"/>
+        </w:rPr>
+      </w:pPr>
+    </w:p>
+    <w:p>
+      <w:pPr>
+        <w:rPr>
+          <w:b/>
+          <w:bCs/>
+          <w:sz w:val="24"/>
+          <w:szCs w:val="24"/>
+        </w:rPr>
+      </w:pPr>
+      <w:r>
+        <w:rPr>
+          <w:b/>
+          <w:bCs/>
+          <w:sz w:val="24"/>
+          <w:szCs w:val="24"/>
+        </w:rPr>
+        <w:t xml:space="preserve">Session </w:t>
+      </w:r>
+      <w:r>
+        <w:rPr>
+          <w:b/>
+          <w:bCs/>
+          <w:sz w:val="24"/>
+          <w:szCs w:val="24"/>
+        </w:rPr>
+        <w:t>#</w:t>
+      </w:r>
+      <w:r>
+        <w:rPr>
+          <w:b/>
+          <w:bCs/>
+          <w:sz w:val="24"/>
+          <w:szCs w:val="24"/>
+        </w:rPr>
+        <w:t xml:space="preserve">: </w:t>
+      </w:r>
+    </w:p>
+    <w:p>
+      <w:pPr>
+        <w:rPr>
+          <w:b/>
+          <w:bCs/>
+          <w:sz w:val="24"/>
+          <w:szCs w:val="24"/>
+        </w:rPr>
+      </w:pPr>
+      <w:r>
+        <w:rPr>
+          <w:b/>
+          <w:bCs/>
+          <w:sz w:val="24"/>
+          <w:szCs w:val="24"/>
+        </w:rPr>
+        <w:t xml:space="preserve">Date: </w:t>
+      </w:r>
+      <w:r>
+        <w:rPr>
+          <w:b/>
+          <w:bCs/>
+          <w:sz w:val="24"/>
+          <w:szCs w:val="24"/>
+        </w:rPr>
+        <w:t>12/5/2024</w:t>
       </w:r>
     </w:p>
     <w:p>
@@ -4447,7 +4943,7 @@
   <w:abstractNum w:abstractNumId="15" w15:restartNumberingAfterBreak="0">
     <w:nsid w:val="76B67A47"/>
     <w:multiLevelType w:val="hybridMultilevel"/>
-    <w:tmpl w:val="9B848592"/>
+    <w:tmpl w:val="E09EA9D0"/>
     <w:lvl w:ilvl="0" w:tplc="04090001">
       <w:start w:val="1"/>
       <w:numFmt w:val="bullet"/>
@@ -4558,6 +5054,119 @@
     </w:lvl>
   </w:abstractNum>
   <w:abstractNum w:abstractNumId="16" w15:restartNumberingAfterBreak="0">
+    <w:nsid w:val="7BE7238A"/>
+    <w:multiLevelType w:val="hybridMultilevel"/>
+    <w:tmpl w:val="23F62174"/>
+    <w:lvl w:ilvl="0" w:tplc="04090001">
+      <w:start w:val="1"/>
+      <w:numFmt w:val="bullet"/>
+      <w:lvlText w:val=""/>
+      <w:lvlJc w:val="left"/>
+      <w:pPr>
+        <w:ind w:left="720" w:hanging="360"/>
+      </w:pPr>
+      <w:rPr>
+        <w:rFonts w:ascii="Symbol" w:hAnsi="Symbol" w:hint="default"/>
+      </w:rPr>
+    </w:lvl>
+    <w:lvl w:ilvl="1" w:tplc="04090003" w:tentative="1">
+      <w:start w:val="1"/>
+      <w:numFmt w:val="bullet"/>
+      <w:lvlText w:val="o"/>
+      <w:lvlJc w:val="left"/>
+      <w:pPr>
+        <w:ind w:left="1440" w:hanging="360"/>
+      </w:pPr>
+      <w:rPr>
+        <w:rFonts w:ascii="Courier New" w:hAnsi="Courier New" w:cs="Courier New" w:hint="default"/>
+      </w:rPr>
+    </w:lvl>
+    <w:lvl w:ilvl="2" w:tplc="04090005" w:tentative="1">
+      <w:start w:val="1"/>
+      <w:numFmt w:val="bullet"/>
+      <w:lvlText w:val=""/>
+      <w:lvlJc w:val="left"/>
+      <w:pPr>
+        <w:ind w:left="2160" w:hanging="360"/>
+      </w:pPr>
+      <w:rPr>
+        <w:rFonts w:ascii="Wingdings" w:hAnsi="Wingdings" w:hint="default"/>
+      </w:rPr>
+    </w:lvl>
+    <w:lvl w:ilvl="3" w:tplc="04090001" w:tentative="1">
+      <w:start w:val="1"/>
+      <w:numFmt w:val="bullet"/>
+      <w:lvlText w:val=""/>
+      <w:lvlJc w:val="left"/>
+      <w:pPr>
+        <w:ind w:left="2880" w:hanging="360"/>
+      </w:pPr>
+      <w:rPr>
+        <w:rFonts w:ascii="Symbol" w:hAnsi="Symbol" w:hint="default"/>
+      </w:rPr>
+    </w:lvl>
+    <w:lvl w:ilvl="4" w:tplc="04090003" w:tentative="1">
+      <w:start w:val="1"/>
+      <w:numFmt w:val="bullet"/>
+      <w:lvlText w:val="o"/>
+      <w:lvlJc w:val="left"/>
+      <w:pPr>
+        <w:ind w:left="3600" w:hanging="360"/>
+      </w:pPr>
+      <w:rPr>
+        <w:rFonts w:ascii="Courier New" w:hAnsi="Courier New" w:cs="Courier New" w:hint="default"/>
+      </w:rPr>
+    </w:lvl>
+    <w:lvl w:ilvl="5" w:tplc="04090005" w:tentative="1">
+      <w:start w:val="1"/>
+      <w:numFmt w:val="bullet"/>
+      <w:lvlText w:val=""/>
+      <w:lvlJc w:val="left"/>
+      <w:pPr>
+        <w:ind w:left="4320" w:hanging="360"/>
+      </w:pPr>
+      <w:rPr>
+        <w:rFonts w:ascii="Wingdings" w:hAnsi="Wingdings" w:hint="default"/>
+      </w:rPr>
+    </w:lvl>
+    <w:lvl w:ilvl="6" w:tplc="04090001" w:tentative="1">
+      <w:start w:val="1"/>
+      <w:numFmt w:val="bullet"/>
+      <w:lvlText w:val=""/>
+      <w:lvlJc w:val="left"/>
+      <w:pPr>
+        <w:ind w:left="5040" w:hanging="360"/>
+      </w:pPr>
+      <w:rPr>
+        <w:rFonts w:ascii="Symbol" w:hAnsi="Symbol" w:hint="default"/>
+      </w:rPr>
+    </w:lvl>
+    <w:lvl w:ilvl="7" w:tplc="04090003" w:tentative="1">
+      <w:start w:val="1"/>
+      <w:numFmt w:val="bullet"/>
+      <w:lvlText w:val="o"/>
+      <w:lvlJc w:val="left"/>
+      <w:pPr>
+        <w:ind w:left="5760" w:hanging="360"/>
+      </w:pPr>
+      <w:rPr>
+        <w:rFonts w:ascii="Courier New" w:hAnsi="Courier New" w:cs="Courier New" w:hint="default"/>
+      </w:rPr>
+    </w:lvl>
+    <w:lvl w:ilvl="8" w:tplc="04090005" w:tentative="1">
+      <w:start w:val="1"/>
+      <w:numFmt w:val="bullet"/>
+      <w:lvlText w:val=""/>
+      <w:lvlJc w:val="left"/>
+      <w:pPr>
+        <w:ind w:left="6480" w:hanging="360"/>
+      </w:pPr>
+      <w:rPr>
+        <w:rFonts w:ascii="Wingdings" w:hAnsi="Wingdings" w:hint="default"/>
+      </w:rPr>
+    </w:lvl>
+  </w:abstractNum>
+  <w:abstractNum w:abstractNumId="17" w15:restartNumberingAfterBreak="0">
     <w:nsid w:val="7D334EC2"/>
     <w:multiLevelType w:val="hybridMultilevel"/>
     <w:tmpl w:val="69D6942E"/>
@@ -4686,7 +5295,7 @@
     <w:abstractNumId w:val="13"/>
   </w:num>
   <w:num w:numId="6" w16cid:durableId="2062122492">
-    <w:abstractNumId w:val="16"/>
+    <w:abstractNumId w:val="17"/>
   </w:num>
   <w:num w:numId="7" w16cid:durableId="1028678853">
     <w:abstractNumId w:val="2"/>
@@ -4720,6 +5329,9 @@
   </w:num>
   <w:num w:numId="17" w16cid:durableId="1012800259">
     <w:abstractNumId w:val="15"/>
+  </w:num>
+  <w:num w:numId="18" w16cid:durableId="446583392">
+    <w:abstractNumId w:val="16"/>
   </w:num>
 </w:numbering>
 </file>
@@ -5124,7 +5736,7 @@
   <w:style w:type="paragraph" w:default="1" w:styleId="Normal">
     <w:name w:val="Normal"/>
     <w:qFormat/>
-    <w:rsid w:val="008F09C6"/>
+    <w:rsid w:val="0046253B"/>
   </w:style>
   <w:style w:type="character" w:default="1" w:styleId="DefaultParagraphFont">
     <w:name w:val="Default Paragraph Font"/>

</xml_diff>